<commit_message>
Add unemployment bar chart as Figure 1 and renumber existing figures
Co-Authored-By: Claude Fable 5 <noreply@anthropic.com>
Claude-Session: https://claude.ai/code/session_017iN25dEU9opw3mcZrrJ2FD
</commit_message>
<xml_diff>
--- a/docs/נייר-מדיניות-אבטלה-בחברה-הערבית-מתוקן.docx
+++ b/docs/נייר-מדיניות-אבטלה-בחברה-הערבית-מתוקן.docx
@@ -2373,6 +2373,72 @@
     </w:p>
     <w:p>
       <w:pPr>
+        <w:spacing w:before="120" w:after="40" w:line="360" w:lineRule="auto"/>
+        <w:jc w:val="both"/>
+      </w:pPr>
+      <w:r>
+        <w:rPr>
+          <w:noProof/>
+        </w:rPr>
+        <w:drawing>
+          <wp:inline distT="0" distB="0" distL="0" distR="0" wp14:anchorId="61398171" wp14:editId="7627BFE3">
+            <wp:extent cx="5212080" cy="2439090"/>
+            <wp:effectExtent l="0" t="0" r="0" b="0"/>
+            <wp:docPr id="990" name="chart_unemployment" descr="שיעורי תעסוקה ערבים יהודים" title="שיעורי תעסוקה ערבים יהודים"/>
+            <wp:cNvGraphicFramePr>
+              <a:graphicFrameLocks xmlns:a="http://schemas.openxmlformats.org/drawingml/2006/main" noChangeAspect="1"/>
+            </wp:cNvGraphicFramePr>
+            <a:graphic xmlns:a="http://schemas.openxmlformats.org/drawingml/2006/main">
+              <a:graphicData uri="http://schemas.openxmlformats.org/drawingml/2006/picture">
+                <pic:pic xmlns:pic="http://schemas.openxmlformats.org/drawingml/2006/picture">
+                  <pic:nvPicPr>
+                    <pic:cNvPr id="990" name=""/>
+                    <pic:cNvPicPr>
+                      <a:picLocks noChangeAspect="1" noChangeArrowheads="1"/>
+                    </pic:cNvPicPr>
+                  </pic:nvPicPr>
+                  <pic:blipFill>
+                    <a:blip r:embed="rId100"/>
+                    <a:srcRect/>
+                    <a:stretch>
+                      <a:fillRect/>
+                    </a:stretch>
+                  </pic:blipFill>
+                  <pic:spPr bwMode="auto">
+                    <a:xfrm>
+                      <a:off x="0" y="0"/>
+                      <a:ext cx="5212080" cy="2439090"/>
+                    </a:xfrm>
+                    <a:prstGeom prst="rect">
+                      <a:avLst/>
+                    </a:prstGeom>
+                  </pic:spPr>
+                </pic:pic>
+              </a:graphicData>
+            </a:graphic>
+          </wp:inline>
+        </w:drawing>
+      </w:r>
+    </w:p>
+    <w:p>
+      <w:pPr>
+        <w:spacing w:after="200" w:line="360" w:lineRule="auto"/>
+        <w:jc w:val="both"/>
+      </w:pPr>
+      <w:r>
+        <w:rPr>
+          <w:i/>
+          <w:iCs/>
+          <w:color w:val="595959"/>
+          <w:sz w:val="20"/>
+          <w:szCs w:val="20"/>
+          <w:rtl/>
+        </w:rPr>
+        <w:t>תרשים 1: שיעורי אבטלה בחברה הערבית ובחברה היהודית: שנת 2022 ואבטלה רחבה בעת המלחמה. מקור: עיבוד נתוני המכון הישראלי לדמוקרטיה (2023) ובנק ישראל (2024ב).</w:t>
+      </w:r>
+    </w:p>
+    <w:p>
+      <w:pPr>
         <w:spacing w:after="160" w:line="360" w:lineRule="auto"/>
         <w:jc w:val="both"/>
       </w:pPr>
@@ -2446,7 +2512,7 @@
           <w:szCs w:val="20"/>
           <w:rtl/>
         </w:rPr>
-        <w:t>תרשים 1: שיעורי תעסוקה לפי קבוצת אוכלוסייה ומגדר. מקור: עיבוד נתוני הלשכה המרכזית לסטטיסטיקה, דוח פני החברה מס’ 14 (2023).</w:t>
+        <w:t>תרשים 2: שיעורי תעסוקה לפי קבוצת אוכלוסייה ומגדר. מקור: עיבוד נתוני הלשכה המרכזית לסטטיסטיקה, דוח פני החברה מס’ 14 (2023).</w:t>
       </w:r>
     </w:p>
     <w:p>
@@ -4175,7 +4241,7 @@
           <w:szCs w:val="20"/>
           <w:rtl/>
         </w:rPr>
-        <w:t>תרשים 2: היקף תקציבי של תוכניות החומש 922 ו-550. מקור: בנק ישראל (2024א); המכון הישראלי לדמוקרטיה (2024).</w:t>
+        <w:t>תרשים 3: היקף תקציבי של תוכניות החומש 922 ו-550. מקור: בנק ישראל (2024א); המכון הישראלי לדמוקרטיה (2024).</w:t>
       </w:r>
     </w:p>
     <w:p>
@@ -4287,7 +4353,7 @@
           <w:szCs w:val="20"/>
           <w:rtl/>
         </w:rPr>
-        <w:t>תרשים 3: שיעור חסרי מעש (NEET) בקרב גברים ערבים בני 18–24, 2015–2024. מקור: מדד אלפנאר (2024; 2025).</w:t>
+        <w:t>תרשים 4: שיעור חסרי מעש (NEET) בקרב גברים ערבים בני 18–24, 2015–2024. מקור: מדד אלפנאר (2024; 2025).</w:t>
       </w:r>
     </w:p>
     <w:p>

</xml_diff>